<commit_message>
To Add Data under MR Successfully and Improve serial validation and prevent duplicate imports
</commit_message>
<xml_diff>
--- a/backups/migrations.docx
+++ b/backups/migrations.docx
@@ -2,6 +2,7 @@
 <file path=word/document.xml><?xml version="1.0" encoding="utf-8"?>
 <w:document xmlns:wpc="http://schemas.microsoft.com/office/word/2010/wordprocessingCanvas" xmlns:cx="http://schemas.microsoft.com/office/drawing/2014/chartex" xmlns:cx1="http://schemas.microsoft.com/office/drawing/2015/9/8/chartex" xmlns:cx2="http://schemas.microsoft.com/office/drawing/2015/10/21/chartex" xmlns:cx3="http://schemas.microsoft.com/office/drawing/2016/5/9/chartex" xmlns:cx4="http://schemas.microsoft.com/office/drawing/2016/5/10/chartex" xmlns:cx5="http://schemas.microsoft.com/office/drawing/2016/5/11/chartex" xmlns:cx6="http://schemas.microsoft.com/office/drawing/2016/5/12/chartex" xmlns:cx7="http://schemas.microsoft.com/office/drawing/2016/5/13/chartex" xmlns:cx8="http://schemas.microsoft.com/office/drawing/2016/5/14/chartex" xmlns:mc="http://schemas.openxmlformats.org/markup-compatibility/2006" xmlns:aink="http://schemas.microsoft.com/office/drawing/2016/ink" xmlns:am3d="http://schemas.microsoft.com/office/drawing/2017/model3d" xmlns:o="urn:schemas-microsoft-com:office:office" xmlns:oel="http://schemas.microsoft.com/office/2019/extlst" xmlns:r="http://schemas.openxmlformats.org/officeDocument/2006/relationships" xmlns:m="http://schemas.openxmlformats.org/officeDocument/2006/math" xmlns:v="urn:schemas-microsoft-com:vml" xmlns:wp14="http://schemas.microsoft.com/office/word/2010/wordprocessingDrawing" xmlns:wp="http://schemas.openxmlformats.org/drawingml/2006/wordprocessingDrawing" xmlns:w10="urn:schemas-microsoft-com:office:word" xmlns:w="http://schemas.openxmlformats.org/wordprocessingml/2006/main" xmlns:w14="http://schemas.microsoft.com/office/word/2010/wordml" xmlns:w15="http://schemas.microsoft.com/office/word/2012/wordml" xmlns:w16cex="http://schemas.microsoft.com/office/word/2018/wordml/cex" xmlns:w16cid="http://schemas.microsoft.com/office/word/2016/wordml/cid" xmlns:w16="http://schemas.microsoft.com/office/word/2018/wordml" xmlns:w16du="http://schemas.microsoft.com/office/word/2023/wordml/word16du" xmlns:w16sdtdh="http://schemas.microsoft.com/office/word/2020/wordml/sdtdatahash" xmlns:w16sdtfl="http://schemas.microsoft.com/office/word/2024/wordml/sdtformatlock" xmlns:w16se="http://schemas.microsoft.com/office/word/2015/wordml/symex" xmlns:wpg="http://schemas.microsoft.com/office/word/2010/wordprocessingGroup" xmlns:wpi="http://schemas.microsoft.com/office/word/2010/wordprocessingInk" xmlns:wne="http://schemas.microsoft.com/office/word/2006/wordml" xmlns:wps="http://schemas.microsoft.com/office/word/2010/wordprocessingShape" mc:Ignorable="w14 w15 w16se w16cid w16 w16cex w16sdtdh w16sdtfl w16du wp14">
   <w:body>
+    <w:p/>
     <w:p/>
     <w:p>
       <w:hyperlink r:id="rId4" w:history="1">
@@ -82,6 +83,7 @@
     <w:p/>
     <w:p>
       <w:r>
+        <w:lastRenderedPageBreak/>
         <w:t xml:space="preserve">    Directory: D:\ITM-Data\itm\backups</w:t>
       </w:r>
     </w:p>
@@ -191,295 +193,454 @@
     </w:p>
     <w:p>
       <w:r>
+        <w:lastRenderedPageBreak/>
         <w:t>;     Dumped by pg_dump version: 18.4</w:t>
       </w:r>
     </w:p>
     <w:p>
       <w:r>
+        <w:t>;</w:t>
+      </w:r>
+    </w:p>
+    <w:p>
+      <w:r>
+        <w:t>;</w:t>
+      </w:r>
+    </w:p>
+    <w:p>
+      <w:r>
+        <w:t>; Selected TOC Entries:</w:t>
+      </w:r>
+    </w:p>
+    <w:p>
+      <w:r>
+        <w:t>;</w:t>
+      </w:r>
+    </w:p>
+    <w:p>
+      <w:r>
+        <w:t>10; 2615 66124 SCHEMA - backup postgres</w:t>
+      </w:r>
+    </w:p>
+    <w:p>
+      <w:r>
+        <w:t>7; 2615 25024 SCHEMA - old_import postgres</w:t>
+      </w:r>
+    </w:p>
+    <w:p>
+      <w:r>
+        <w:t>6199; 0 0 ACL - SCHEMA public pg_database_owner</w:t>
+      </w:r>
+    </w:p>
+    <w:p>
+      <w:r>
+        <w:t>2; 3079 16711 EXTENSION - pg_trgm</w:t>
+      </w:r>
+    </w:p>
+    <w:p>
+      <w:r>
+        <w:t>6200; 0 0 COMMENT - EXTENSION pg_trgm</w:t>
+      </w:r>
+    </w:p>
+    <w:p>
+      <w:r>
+        <w:t>PS D:\ITM-Data\itm&gt; Test-Path "D:\ITM-Data\itm\backups\ITM_Fix\sql\009_scm_partial_import_resolution.sql"</w:t>
+      </w:r>
+    </w:p>
+    <w:p>
+      <w:r>
+        <w:t>True</w:t>
+      </w:r>
+    </w:p>
+    <w:p>
+      <w:r>
+        <w:t>PS D:\ITM-Data\itm&gt; Get-Content "D:\ITM-Data\itm\backups\ITM_Fix\sql\009_scm_partial_import_resolution.sql"</w:t>
+      </w:r>
+    </w:p>
+    <w:p>
+      <w:r>
+        <w:t>BEGIN;</w:t>
+      </w:r>
+    </w:p>
+    <w:p/>
+    <w:p>
+      <w:r>
+        <w:t>/*</w:t>
+      </w:r>
+    </w:p>
+    <w:p>
+      <w:r>
+        <w:t xml:space="preserve">  SCM partial-import / serial-conflict resolution support.</w:t>
+      </w:r>
+    </w:p>
+    <w:p/>
+    <w:p>
+      <w:r>
+        <w:t xml:space="preserve">  Goal:</w:t>
+      </w:r>
+    </w:p>
+    <w:p>
+      <w:r>
+        <w:t xml:space="preserve">  - every SCM row can be committed to stack_inventory;</w:t>
+      </w:r>
+    </w:p>
+    <w:p>
+      <w:r>
+        <w:t xml:space="preserve">  - asset_devices still keeps one physical row per normalized serial;</w:t>
+      </w:r>
+    </w:p>
+    <w:p>
+      <w:r>
+        <w:t xml:space="preserve">  - a conflicting serial is recorded as a stock-level conflict, not duplicated;</w:t>
+      </w:r>
+    </w:p>
+    <w:p>
+      <w:r>
+        <w:t xml:space="preserve">  - retry after SCM serial correction updates the SAME stock row by MR + source index.</w:t>
+      </w:r>
+    </w:p>
+    <w:p>
+      <w:r>
+        <w:t>*/</w:t>
+      </w:r>
+    </w:p>
+    <w:p/>
+    <w:p>
+      <w:r>
         <w:lastRenderedPageBreak/>
-        <w:t>;</w:t>
-      </w:r>
-    </w:p>
-    <w:p>
-      <w:r>
-        <w:t>;</w:t>
-      </w:r>
-    </w:p>
-    <w:p>
-      <w:r>
-        <w:t>; Selected TOC Entries:</w:t>
-      </w:r>
-    </w:p>
-    <w:p>
-      <w:r>
-        <w:t>;</w:t>
-      </w:r>
-    </w:p>
-    <w:p>
-      <w:r>
-        <w:t>10; 2615 66124 SCHEMA - backup postgres</w:t>
-      </w:r>
-    </w:p>
-    <w:p>
-      <w:r>
-        <w:t>7; 2615 25024 SCHEMA - old_import postgres</w:t>
-      </w:r>
-    </w:p>
-    <w:p>
-      <w:r>
-        <w:t>6199; 0 0 ACL - SCHEMA public pg_database_owner</w:t>
-      </w:r>
-    </w:p>
-    <w:p>
-      <w:r>
-        <w:t>2; 3079 16711 EXTENSION - pg_trgm</w:t>
-      </w:r>
-    </w:p>
-    <w:p>
-      <w:r>
-        <w:t>6200; 0 0 COMMENT - EXTENSION pg_trgm</w:t>
-      </w:r>
-    </w:p>
-    <w:p>
-      <w:r>
-        <w:t>PS D:\ITM-Data\itm&gt; Test-Path "D:\ITM-Data\itm\backups\ITM_Fix\sql\009_scm_partial_import_resolution.sql"</w:t>
-      </w:r>
-    </w:p>
-    <w:p>
-      <w:r>
-        <w:t>True</w:t>
-      </w:r>
-    </w:p>
-    <w:p>
-      <w:r>
-        <w:t>PS D:\ITM-Data\itm&gt; Get-Content "D:\ITM-Data\itm\backups\ITM_Fix\sql\009_scm_partial_import_resolution.sql"</w:t>
-      </w:r>
-    </w:p>
-    <w:p>
-      <w:r>
-        <w:t>BEGIN;</w:t>
-      </w:r>
-    </w:p>
-    <w:p/>
-    <w:p>
-      <w:r>
-        <w:t>/*</w:t>
-      </w:r>
-    </w:p>
-    <w:p>
-      <w:r>
-        <w:t xml:space="preserve">  SCM partial-import / serial-conflict resolution support.</w:t>
-      </w:r>
-    </w:p>
-    <w:p/>
-    <w:p>
-      <w:r>
-        <w:t xml:space="preserve">  Goal:</w:t>
-      </w:r>
-    </w:p>
-    <w:p>
-      <w:r>
-        <w:t xml:space="preserve">  - every SCM row can be committed to stack_inventory;</w:t>
-      </w:r>
-    </w:p>
-    <w:p>
-      <w:r>
-        <w:t xml:space="preserve">  - asset_devices still keeps one physical row per normalized serial;</w:t>
-      </w:r>
-    </w:p>
-    <w:p>
-      <w:r>
-        <w:t xml:space="preserve">  - a conflicting serial is recorded as a stock-level conflict, not duplicated;</w:t>
-      </w:r>
-    </w:p>
-    <w:p>
-      <w:r>
-        <w:t xml:space="preserve">  - retry after SCM serial correction updates the SAME stock row by MR + source index.</w:t>
-      </w:r>
-    </w:p>
-    <w:p>
-      <w:r>
-        <w:t>*/</w:t>
-      </w:r>
-    </w:p>
-    <w:p/>
-    <w:p>
-      <w:r>
         <w:t>ALTER TABLE public.stack_inventory</w:t>
       </w:r>
     </w:p>
     <w:p>
       <w:r>
+        <w:t xml:space="preserve">    ADD COLUMN IF NOT EXISTS scm_source_index INTEGER,</w:t>
+      </w:r>
+    </w:p>
+    <w:p>
+      <w:r>
+        <w:t xml:space="preserve">    ADD COLUMN IF NOT EXISTS asset_device_id BIGINT,</w:t>
+      </w:r>
+    </w:p>
+    <w:p>
+      <w:r>
+        <w:t xml:space="preserve">    ADD COLUMN IF NOT EXISTS asset_resolution VARCHAR(32),</w:t>
+      </w:r>
+    </w:p>
+    <w:p>
+      <w:r>
+        <w:t xml:space="preserve">    ADD COLUMN IF NOT EXISTS asset_conflict_asset_id BIGINT,</w:t>
+      </w:r>
+    </w:p>
+    <w:p>
+      <w:r>
+        <w:t xml:space="preserve">    ADD COLUMN IF NOT EXISTS asset_resolution_note TEXT;</w:t>
+      </w:r>
+    </w:p>
+    <w:p/>
+    <w:p>
+      <w:r>
+        <w:t>/* Existing linked stock rows can be backfilled safely from legacy_stack_id. */</w:t>
+      </w:r>
+    </w:p>
+    <w:p>
+      <w:r>
+        <w:t>WITH linked AS (</w:t>
+      </w:r>
+    </w:p>
+    <w:p>
+      <w:r>
+        <w:t xml:space="preserve">    SELECT DISTINCT ON (ad.legacy_stack_id)</w:t>
+      </w:r>
+    </w:p>
+    <w:p>
+      <w:r>
+        <w:t xml:space="preserve">        ad.legacy_stack_id AS stock_id,</w:t>
+      </w:r>
+    </w:p>
+    <w:p>
+      <w:r>
+        <w:t xml:space="preserve">        ad.id AS asset_id</w:t>
+      </w:r>
+    </w:p>
+    <w:p>
+      <w:r>
+        <w:t xml:space="preserve">    FROM public.asset_devices ad</w:t>
+      </w:r>
+    </w:p>
+    <w:p>
+      <w:r>
+        <w:t xml:space="preserve">    WHERE ad.legacy_stack_id IS NOT NULL</w:t>
+      </w:r>
+    </w:p>
+    <w:p>
+      <w:r>
+        <w:t xml:space="preserve">      AND COALESCE(ad.row_status, 1) = 1</w:t>
+      </w:r>
+    </w:p>
+    <w:p>
+      <w:r>
+        <w:t xml:space="preserve">    ORDER BY ad.legacy_stack_id, ad.id DESC</w:t>
+      </w:r>
+    </w:p>
+    <w:p>
+      <w:r>
+        <w:t>)</w:t>
+      </w:r>
+    </w:p>
+    <w:p>
+      <w:r>
+        <w:t>UPDATE public.stack_inventory s</w:t>
+      </w:r>
+    </w:p>
+    <w:p>
+      <w:r>
+        <w:t>SET asset_device_id = linked.asset_id,</w:t>
+      </w:r>
+    </w:p>
+    <w:p>
+      <w:r>
+        <w:t xml:space="preserve">    asset_resolution = COALESCE(NULLIF(BTRIM(s.asset_resolution), ''), 'linked_legacy')</w:t>
+      </w:r>
+    </w:p>
+    <w:p>
+      <w:r>
+        <w:t>FROM linked</w:t>
+      </w:r>
+    </w:p>
+    <w:p>
+      <w:r>
+        <w:t>WHERE linked.stock_id = s.id</w:t>
+      </w:r>
+    </w:p>
+    <w:p>
+      <w:r>
+        <w:t xml:space="preserve">  AND s.asset_device_id IS NULL;</w:t>
+      </w:r>
+    </w:p>
+    <w:p/>
+    <w:p>
+      <w:r>
+        <w:t>/* New SCM imports are idempotent by the stable row index returned by SCM. */</w:t>
+      </w:r>
+    </w:p>
+    <w:p>
+      <w:r>
+        <w:t>CREATE UNIQUE INDEX IF NOT EXISTS uq_stack_inventory_scm_mr_source</w:t>
+      </w:r>
+    </w:p>
+    <w:p>
+      <w:r>
         <w:lastRenderedPageBreak/>
-        <w:t xml:space="preserve">    ADD COLUMN IF NOT EXISTS scm_source_index INTEGER,</w:t>
-      </w:r>
-    </w:p>
-    <w:p>
-      <w:r>
-        <w:t xml:space="preserve">    ADD COLUMN IF NOT EXISTS asset_device_id BIGINT,</w:t>
-      </w:r>
-    </w:p>
-    <w:p>
-      <w:r>
-        <w:t xml:space="preserve">    ADD COLUMN IF NOT EXISTS asset_resolution VARCHAR(32),</w:t>
-      </w:r>
-    </w:p>
-    <w:p>
-      <w:r>
-        <w:t xml:space="preserve">    ADD COLUMN IF NOT EXISTS asset_conflict_asset_id BIGINT,</w:t>
-      </w:r>
-    </w:p>
-    <w:p>
-      <w:r>
-        <w:t xml:space="preserve">    ADD COLUMN IF NOT EXISTS asset_resolution_note TEXT;</w:t>
-      </w:r>
-    </w:p>
-    <w:p/>
-    <w:p>
-      <w:r>
-        <w:t>/* Existing linked stock rows can be backfilled safely from legacy_stack_id. */</w:t>
-      </w:r>
-    </w:p>
-    <w:p>
-      <w:r>
-        <w:t>WITH linked AS (</w:t>
-      </w:r>
-    </w:p>
-    <w:p>
-      <w:r>
-        <w:t xml:space="preserve">    SELECT DISTINCT ON (ad.legacy_stack_id)</w:t>
-      </w:r>
-    </w:p>
-    <w:p>
-      <w:r>
-        <w:t xml:space="preserve">        ad.legacy_stack_id AS stock_id,</w:t>
-      </w:r>
-    </w:p>
-    <w:p>
-      <w:r>
-        <w:t xml:space="preserve">        ad.id AS asset_id</w:t>
-      </w:r>
-    </w:p>
-    <w:p>
-      <w:r>
-        <w:t xml:space="preserve">    FROM public.asset_devices ad</w:t>
-      </w:r>
-    </w:p>
-    <w:p>
-      <w:r>
-        <w:t xml:space="preserve">    WHERE ad.legacy_stack_id IS NOT NULL</w:t>
-      </w:r>
-    </w:p>
-    <w:p>
-      <w:r>
-        <w:t xml:space="preserve">      AND COALESCE(ad.row_status, 1) = 1</w:t>
-      </w:r>
-    </w:p>
-    <w:p>
-      <w:r>
-        <w:t xml:space="preserve">    ORDER BY ad.legacy_stack_id, ad.id DESC</w:t>
-      </w:r>
-    </w:p>
-    <w:p>
-      <w:r>
-        <w:t>)</w:t>
-      </w:r>
-    </w:p>
-    <w:p>
-      <w:r>
-        <w:t>UPDATE public.stack_inventory s</w:t>
-      </w:r>
-    </w:p>
-    <w:p>
-      <w:r>
-        <w:t>SET asset_device_id = linked.asset_id,</w:t>
-      </w:r>
-    </w:p>
-    <w:p>
-      <w:r>
-        <w:t xml:space="preserve">    asset_resolution = COALESCE(NULLIF(BTRIM(s.asset_resolution), ''), 'linked_legacy')</w:t>
-      </w:r>
-    </w:p>
-    <w:p>
-      <w:r>
-        <w:t>FROM linked</w:t>
-      </w:r>
-    </w:p>
-    <w:p>
-      <w:r>
-        <w:t>WHERE linked.stock_id = s.id</w:t>
-      </w:r>
-    </w:p>
-    <w:p>
-      <w:r>
-        <w:t xml:space="preserve">  AND s.asset_device_id IS NULL;</w:t>
-      </w:r>
-    </w:p>
-    <w:p/>
-    <w:p>
-      <w:r>
-        <w:t>/* New SCM imports are idempotent by the stable row index returned by SCM. */</w:t>
-      </w:r>
-    </w:p>
-    <w:p>
-      <w:r>
-        <w:t>CREATE UNIQUE INDEX IF NOT EXISTS uq_stack_inventory_scm_mr_source</w:t>
-      </w:r>
-    </w:p>
-    <w:p>
-      <w:r>
         <w:t>ON public.stack_inventory (mr_id, scm_source_index)</w:t>
       </w:r>
     </w:p>
     <w:p>
       <w:r>
+        <w:t>WHERE scm_source_index IS NOT NULL</w:t>
+      </w:r>
+    </w:p>
+    <w:p>
+      <w:r>
+        <w:t xml:space="preserve">  AND COALESCE(status, 1) = 1;</w:t>
+      </w:r>
+    </w:p>
+    <w:p/>
+    <w:p>
+      <w:r>
+        <w:t>CREATE INDEX IF NOT EXISTS idx_stack_inventory_asset_device_id</w:t>
+      </w:r>
+    </w:p>
+    <w:p>
+      <w:r>
+        <w:t>ON public.stack_inventory(asset_device_id)</w:t>
+      </w:r>
+    </w:p>
+    <w:p>
+      <w:r>
+        <w:t>WHERE asset_device_id IS NOT NULL;</w:t>
+      </w:r>
+    </w:p>
+    <w:p/>
+    <w:p>
+      <w:r>
+        <w:t>CREATE INDEX IF NOT EXISTS idx_stack_inventory_conflict_asset_id</w:t>
+      </w:r>
+    </w:p>
+    <w:p>
+      <w:r>
+        <w:t>ON public.stack_inventory(asset_conflict_asset_id)</w:t>
+      </w:r>
+    </w:p>
+    <w:p>
+      <w:r>
+        <w:t>WHERE asset_conflict_asset_id IS NOT NULL;</w:t>
+      </w:r>
+    </w:p>
+    <w:p/>
+    <w:p>
+      <w:r>
+        <w:t>DO $$</w:t>
+      </w:r>
+    </w:p>
+    <w:p>
+      <w:r>
+        <w:t>BEGIN</w:t>
+      </w:r>
+    </w:p>
+    <w:p>
+      <w:r>
+        <w:t xml:space="preserve">    IF NOT EXISTS (</w:t>
+      </w:r>
+    </w:p>
+    <w:p>
+      <w:r>
+        <w:t xml:space="preserve">        SELECT 1 FROM pg_constraint</w:t>
+      </w:r>
+    </w:p>
+    <w:p>
+      <w:r>
+        <w:t xml:space="preserve">        WHERE conname = 'fk_stack_inventory_asset_device_id'</w:t>
+      </w:r>
+    </w:p>
+    <w:p>
+      <w:r>
+        <w:t xml:space="preserve">    ) THEN</w:t>
+      </w:r>
+    </w:p>
+    <w:p>
+      <w:r>
+        <w:t xml:space="preserve">        ALTER TABLE public.stack_inventory</w:t>
+      </w:r>
+    </w:p>
+    <w:p>
+      <w:r>
+        <w:t xml:space="preserve">        ADD CONSTRAINT fk_stack_inventory_asset_device_id</w:t>
+      </w:r>
+    </w:p>
+    <w:p>
+      <w:r>
+        <w:t xml:space="preserve">        FOREIGN KEY (asset_device_id)</w:t>
+      </w:r>
+    </w:p>
+    <w:p>
+      <w:r>
+        <w:t xml:space="preserve">        REFERENCES public.asset_devices(id)</w:t>
+      </w:r>
+    </w:p>
+    <w:p>
+      <w:r>
+        <w:t xml:space="preserve">        NOT VALID;</w:t>
+      </w:r>
+    </w:p>
+    <w:p>
+      <w:r>
+        <w:t xml:space="preserve">    END IF;</w:t>
+      </w:r>
+    </w:p>
+    <w:p/>
+    <w:p>
+      <w:r>
+        <w:t xml:space="preserve">    IF NOT EXISTS (</w:t>
+      </w:r>
+    </w:p>
+    <w:p>
+      <w:r>
         <w:lastRenderedPageBreak/>
-        <w:t>WHERE scm_source_index IS NOT NULL</w:t>
-      </w:r>
-    </w:p>
-    <w:p>
-      <w:r>
-        <w:t xml:space="preserve">  AND COALESCE(status, 1) = 1;</w:t>
-      </w:r>
-    </w:p>
-    <w:p/>
-    <w:p>
-      <w:r>
-        <w:t>CREATE INDEX IF NOT EXISTS idx_stack_inventory_asset_device_id</w:t>
-      </w:r>
-    </w:p>
-    <w:p>
-      <w:r>
-        <w:t>ON public.stack_inventory(asset_device_id)</w:t>
-      </w:r>
-    </w:p>
-    <w:p>
-      <w:r>
-        <w:t>WHERE asset_device_id IS NOT NULL;</w:t>
-      </w:r>
-    </w:p>
-    <w:p/>
-    <w:p>
-      <w:r>
-        <w:t>CREATE INDEX IF NOT EXISTS idx_stack_inventory_conflict_asset_id</w:t>
-      </w:r>
-    </w:p>
-    <w:p>
-      <w:r>
-        <w:t>ON public.stack_inventory(asset_conflict_asset_id)</w:t>
-      </w:r>
-    </w:p>
-    <w:p>
-      <w:r>
-        <w:t>WHERE asset_conflict_asset_id IS NOT NULL;</w:t>
-      </w:r>
-    </w:p>
-    <w:p/>
-    <w:p>
-      <w:r>
-        <w:t>DO $$</w:t>
-      </w:r>
-    </w:p>
+        <w:t xml:space="preserve">        SELECT 1 FROM pg_constraint</w:t>
+      </w:r>
+    </w:p>
+    <w:p>
+      <w:r>
+        <w:t xml:space="preserve">        WHERE conname = 'fk_stack_inventory_conflict_asset_id'</w:t>
+      </w:r>
+    </w:p>
+    <w:p>
+      <w:r>
+        <w:t xml:space="preserve">    ) THEN</w:t>
+      </w:r>
+    </w:p>
+    <w:p>
+      <w:r>
+        <w:t xml:space="preserve">        ALTER TABLE public.stack_inventory</w:t>
+      </w:r>
+    </w:p>
+    <w:p>
+      <w:r>
+        <w:t xml:space="preserve">        ADD CONSTRAINT fk_stack_inventory_conflict_asset_id</w:t>
+      </w:r>
+    </w:p>
+    <w:p>
+      <w:r>
+        <w:t xml:space="preserve">        FOREIGN KEY (asset_conflict_asset_id)</w:t>
+      </w:r>
+    </w:p>
+    <w:p>
+      <w:r>
+        <w:t xml:space="preserve">        REFERENCES public.asset_devices(id)</w:t>
+      </w:r>
+    </w:p>
+    <w:p>
+      <w:r>
+        <w:t xml:space="preserve">        NOT VALID;</w:t>
+      </w:r>
+    </w:p>
+    <w:p>
+      <w:r>
+        <w:t xml:space="preserve">    END IF;</w:t>
+      </w:r>
+    </w:p>
+    <w:p>
+      <w:r>
+        <w:t>END $$;</w:t>
+      </w:r>
+    </w:p>
+    <w:p/>
+    <w:p>
+      <w:r>
+        <w:t>COMMIT;</w:t>
+      </w:r>
+    </w:p>
+    <w:p>
+      <w:r>
+        <w:t>PS D:\ITM-Data\itm&gt; &amp; "D:\Program Files\PostgreSQL\18\bin\psql.exe" `</w:t>
+      </w:r>
+    </w:p>
+    <w:p>
+      <w:r>
+        <w:t>&gt;&gt;   -v ON_ERROR_STOP=1 `</w:t>
+      </w:r>
+    </w:p>
+    <w:p>
+      <w:r>
+        <w:t>&gt;&gt;   -h localhost `</w:t>
+      </w:r>
+    </w:p>
+    <w:p>
+      <w:r>
+        <w:t>&gt;&gt;   -p 5432 `</w:t>
+      </w:r>
+    </w:p>
+    <w:p>
+      <w:r>
+        <w:t>&gt;&gt;   -U postgres `</w:t>
+      </w:r>
+    </w:p>
+    <w:p>
+      <w:r>
+        <w:t>&gt;&gt;   -d itm_prod `</w:t>
+      </w:r>
+    </w:p>
+    <w:p>
+      <w:r>
+        <w:t>&gt;&gt;   -f "D:\ITM-Data\itm\backups\ITM_Fix\sql\009_scm_partial_import_resolution.sql"</w:t>
+      </w:r>
+    </w:p>
+    <w:p>
+      <w:r>
+        <w:t>Password for user postgres:</w:t>
+      </w:r>
+    </w:p>
+    <w:p/>
     <w:p>
       <w:r>
         <w:t>BEGIN</w:t>
@@ -487,115 +648,38 @@
     </w:p>
     <w:p>
       <w:r>
-        <w:t xml:space="preserve">    IF NOT EXISTS (</w:t>
-      </w:r>
-    </w:p>
-    <w:p>
-      <w:r>
-        <w:t xml:space="preserve">        SELECT 1 FROM pg_constraint</w:t>
-      </w:r>
-    </w:p>
-    <w:p>
-      <w:r>
-        <w:t xml:space="preserve">        WHERE conname = 'fk_stack_inventory_asset_device_id'</w:t>
-      </w:r>
-    </w:p>
-    <w:p>
-      <w:r>
-        <w:t xml:space="preserve">    ) THEN</w:t>
-      </w:r>
-    </w:p>
-    <w:p>
-      <w:r>
-        <w:t xml:space="preserve">        ALTER TABLE public.stack_inventory</w:t>
-      </w:r>
-    </w:p>
-    <w:p>
-      <w:r>
-        <w:t xml:space="preserve">        ADD CONSTRAINT fk_stack_inventory_asset_device_id</w:t>
-      </w:r>
-    </w:p>
-    <w:p>
-      <w:r>
-        <w:t xml:space="preserve">        FOREIGN KEY (asset_device_id)</w:t>
-      </w:r>
-    </w:p>
-    <w:p>
-      <w:r>
-        <w:t xml:space="preserve">        REFERENCES public.asset_devices(id)</w:t>
-      </w:r>
-    </w:p>
-    <w:p>
-      <w:r>
-        <w:t xml:space="preserve">        NOT VALID;</w:t>
-      </w:r>
-    </w:p>
-    <w:p>
-      <w:r>
-        <w:t xml:space="preserve">    END IF;</w:t>
-      </w:r>
-    </w:p>
-    <w:p/>
-    <w:p>
-      <w:r>
-        <w:t xml:space="preserve">    IF NOT EXISTS (</w:t>
-      </w:r>
-    </w:p>
-    <w:p>
-      <w:r>
-        <w:t xml:space="preserve">        SELECT 1 FROM pg_constraint</w:t>
+        <w:t>ALTER TABLE</w:t>
+      </w:r>
+    </w:p>
+    <w:p>
+      <w:r>
+        <w:t>UPDATE 528</w:t>
+      </w:r>
+    </w:p>
+    <w:p>
+      <w:r>
+        <w:t>CREATE INDEX</w:t>
+      </w:r>
+    </w:p>
+    <w:p>
+      <w:r>
+        <w:t>CREATE INDEX</w:t>
       </w:r>
     </w:p>
     <w:p>
       <w:r>
         <w:lastRenderedPageBreak/>
-        <w:t xml:space="preserve">        WHERE conname = 'fk_stack_inventory_conflict_asset_id'</w:t>
-      </w:r>
-    </w:p>
-    <w:p>
-      <w:r>
-        <w:t xml:space="preserve">    ) THEN</w:t>
-      </w:r>
-    </w:p>
-    <w:p>
-      <w:r>
-        <w:t xml:space="preserve">        ALTER TABLE public.stack_inventory</w:t>
-      </w:r>
-    </w:p>
-    <w:p>
-      <w:r>
-        <w:t xml:space="preserve">        ADD CONSTRAINT fk_stack_inventory_conflict_asset_id</w:t>
-      </w:r>
-    </w:p>
-    <w:p>
-      <w:r>
-        <w:t xml:space="preserve">        FOREIGN KEY (asset_conflict_asset_id)</w:t>
-      </w:r>
-    </w:p>
-    <w:p>
-      <w:r>
-        <w:t xml:space="preserve">        REFERENCES public.asset_devices(id)</w:t>
-      </w:r>
-    </w:p>
-    <w:p>
-      <w:r>
-        <w:t xml:space="preserve">        NOT VALID;</w:t>
-      </w:r>
-    </w:p>
-    <w:p>
-      <w:r>
-        <w:t xml:space="preserve">    END IF;</w:t>
-      </w:r>
-    </w:p>
-    <w:p>
-      <w:r>
-        <w:t>END $$;</w:t>
-      </w:r>
-    </w:p>
-    <w:p/>
-    <w:p>
-      <w:r>
-        <w:t>COMMIT;</w:t>
+        <w:t>CREATE INDEX</w:t>
+      </w:r>
+    </w:p>
+    <w:p>
+      <w:r>
+        <w:t>DO</w:t>
+      </w:r>
+    </w:p>
+    <w:p>
+      <w:r>
+        <w:t>COMMIT</w:t>
       </w:r>
     </w:p>
     <w:p>
@@ -605,6 +689,217 @@
     </w:p>
     <w:p>
       <w:r>
+        <w:t>&gt;&gt;   -h localhost `</w:t>
+      </w:r>
+    </w:p>
+    <w:p>
+      <w:r>
+        <w:t>&gt;&gt;   -p 5432 `</w:t>
+      </w:r>
+    </w:p>
+    <w:p>
+      <w:r>
+        <w:t>&gt;&gt;   -U postgres `</w:t>
+      </w:r>
+    </w:p>
+    <w:p>
+      <w:r>
+        <w:t>&gt;&gt;   -d itm_prod `</w:t>
+      </w:r>
+    </w:p>
+    <w:p>
+      <w:r>
+        <w:t>&gt;&gt;   -c "SELECT column_name, data_type FROM information_schema.columns WHERE table_schema='public' AND table_name='stack_inventory' AND column_name IN ('scm_source_index','asset_device_id','asset_resolution','asset_conflict_asset_id','asset_resolution_note') ORDER BY column_name;"</w:t>
+      </w:r>
+    </w:p>
+    <w:p>
+      <w:r>
+        <w:t>Password for user postgres:</w:t>
+      </w:r>
+    </w:p>
+    <w:p/>
+    <w:p>
+      <w:r>
+        <w:t xml:space="preserve">       column_name       |     data_type</w:t>
+      </w:r>
+    </w:p>
+    <w:p>
+      <w:r>
+        <w:t>-------------------------+-------------------</w:t>
+      </w:r>
+    </w:p>
+    <w:p>
+      <w:r>
+        <w:t xml:space="preserve"> asset_conflict_asset_id | bigint</w:t>
+      </w:r>
+    </w:p>
+    <w:p>
+      <w:r>
+        <w:t xml:space="preserve"> asset_device_id         | bigint</w:t>
+      </w:r>
+    </w:p>
+    <w:p>
+      <w:r>
+        <w:t xml:space="preserve"> asset_resolution        | character varying</w:t>
+      </w:r>
+    </w:p>
+    <w:p>
+      <w:r>
+        <w:t xml:space="preserve"> asset_resolution_note   | text</w:t>
+      </w:r>
+    </w:p>
+    <w:p>
+      <w:r>
+        <w:t xml:space="preserve"> scm_source_index        | integer</w:t>
+      </w:r>
+    </w:p>
+    <w:p>
+      <w:r>
+        <w:t>(5 rows)</w:t>
+      </w:r>
+    </w:p>
+    <w:p/>
+    <w:p/>
+    <w:p>
+      <w:r>
+        <w:t>PS D:\ITM-Data\itm&gt; &amp; "D:\Program Files\PostgreSQL\18\bin\psql.exe" `</w:t>
+      </w:r>
+    </w:p>
+    <w:p>
+      <w:r>
+        <w:t>&gt;&gt;   -h localhost `</w:t>
+      </w:r>
+    </w:p>
+    <w:p>
+      <w:r>
+        <w:t>&gt;&gt;   -p 5432 `</w:t>
+      </w:r>
+    </w:p>
+    <w:p>
+      <w:r>
+        <w:lastRenderedPageBreak/>
+        <w:t>&gt;&gt;   -U postgres `</w:t>
+      </w:r>
+    </w:p>
+    <w:p>
+      <w:r>
+        <w:t>&gt;&gt;   -d itm_prod `</w:t>
+      </w:r>
+    </w:p>
+    <w:p>
+      <w:r>
+        <w:t>&gt;&gt;   -c "SELECT indexname FROM pg_indexes WHERE schemaname='public' AND tablename='stack_inventory' AND indexname IN ('uq_stack_inventory_scm_mr_source','idx_stack_inventory_asset_device_id','idx_stack_inventory_conflict_asset_id');"</w:t>
+      </w:r>
+    </w:p>
+    <w:p>
+      <w:r>
+        <w:t>Password for user postgres:</w:t>
+      </w:r>
+    </w:p>
+    <w:p/>
+    <w:p>
+      <w:r>
+        <w:t xml:space="preserve">               indexname</w:t>
+      </w:r>
+    </w:p>
+    <w:p>
+      <w:r>
+        <w:t>---------------------------------------</w:t>
+      </w:r>
+    </w:p>
+    <w:p>
+      <w:r>
+        <w:t xml:space="preserve"> uq_stack_inventory_scm_mr_source</w:t>
+      </w:r>
+    </w:p>
+    <w:p>
+      <w:r>
+        <w:t xml:space="preserve"> idx_stack_inventory_asset_device_id</w:t>
+      </w:r>
+    </w:p>
+    <w:p>
+      <w:r>
+        <w:t xml:space="preserve"> idx_stack_inventory_conflict_asset_id</w:t>
+      </w:r>
+    </w:p>
+    <w:p>
+      <w:r>
+        <w:t>(3 rows)</w:t>
+      </w:r>
+    </w:p>
+    <w:p/>
+    <w:p/>
+    <w:p>
+      <w:r>
+        <w:t>PS D:\ITM-Data\itm&gt; &amp; "D:\Program Files\PostgreSQL\18\bin\psql.exe" `</w:t>
+      </w:r>
+    </w:p>
+    <w:p>
+      <w:r>
+        <w:t>&gt;&gt;   -h localhost `</w:t>
+      </w:r>
+    </w:p>
+    <w:p>
+      <w:r>
+        <w:t>&gt;&gt;   -p 5432 `</w:t>
+      </w:r>
+    </w:p>
+    <w:p>
+      <w:r>
+        <w:t>&gt;&gt;   -U postgres `</w:t>
+      </w:r>
+    </w:p>
+    <w:p>
+      <w:r>
+        <w:t>&gt;&gt;   -d itm_prod `</w:t>
+      </w:r>
+    </w:p>
+    <w:p>
+      <w:r>
+        <w:t>&gt;&gt;   -c "SELECT conname, convalidated FROM pg_constraint WHERE conname IN ('fk_stack_inventory_asset_device_id','fk_stack_inventory_conflict_asset_id');"</w:t>
+      </w:r>
+    </w:p>
+    <w:p>
+      <w:r>
+        <w:t>Password for user postgres:</w:t>
+      </w:r>
+    </w:p>
+    <w:p/>
+    <w:p>
+      <w:r>
+        <w:t xml:space="preserve">               conname                | convalidated</w:t>
+      </w:r>
+    </w:p>
+    <w:p>
+      <w:r>
+        <w:t>--------------------------------------+--------------</w:t>
+      </w:r>
+    </w:p>
+    <w:p>
+      <w:r>
+        <w:lastRenderedPageBreak/>
+        <w:t xml:space="preserve"> fk_stack_inventory_asset_device_id   | f</w:t>
+      </w:r>
+    </w:p>
+    <w:p>
+      <w:r>
+        <w:t xml:space="preserve"> fk_stack_inventory_conflict_asset_id | f</w:t>
+      </w:r>
+    </w:p>
+    <w:p>
+      <w:r>
+        <w:t>(2 rows)</w:t>
+      </w:r>
+    </w:p>
+    <w:p/>
+    <w:p/>
+    <w:p>
+      <w:r>
+        <w:t>PS D:\ITM-Data\itm&gt; &amp; "D:\Program Files\PostgreSQL\18\bin\psql.exe" `</w:t>
+      </w:r>
+    </w:p>
+    <w:p>
+      <w:r>
         <w:t>&gt;&gt;   -v ON_ERROR_STOP=1 `</w:t>
       </w:r>
     </w:p>
@@ -646,340 +941,47 @@
     </w:p>
     <w:p>
       <w:r>
+        <w:t>psql:D:/ITM-Data/itm/backups/ITM_Fix/sql/009_scm_partial_import_resolution.sql:18: NOTICE:  column "scm_source_index" of relation "stack_inventory" already exists, skipping</w:t>
+      </w:r>
+    </w:p>
+    <w:p>
+      <w:r>
+        <w:t>psql:D:/ITM-Data/itm/backups/ITM_Fix/sql/009_scm_partial_import_resolution.sql:18: NOTICE:  column "asset_device_id" of relation "stack_inventory" already exists, skipping</w:t>
+      </w:r>
+    </w:p>
+    <w:p>
+      <w:r>
+        <w:t>psql:D:/ITM-Data/itm/backups/ITM_Fix/sql/009_scm_partial_import_resolution.sql:18: NOTICE:  column "asset_resolution" of relation "stack_inventory" already exists, skipping</w:t>
+      </w:r>
+    </w:p>
+    <w:p>
+      <w:r>
+        <w:t>psql:D:/ITM-Data/itm/backups/ITM_Fix/sql/009_scm_partial_import_resolution.sql:18: NOTICE:  column "asset_conflict_asset_id" of relation "stack_inventory" already exists, skipping</w:t>
+      </w:r>
+    </w:p>
+    <w:p>
+      <w:r>
+        <w:t>psql:D:/ITM-Data/itm/backups/ITM_Fix/sql/009_scm_partial_import_resolution.sql:18: NOTICE:  column "asset_resolution_note" of relation "stack_inventory" already exists, skipping</w:t>
+      </w:r>
+    </w:p>
+    <w:p>
+      <w:r>
         <w:t>ALTER TABLE</w:t>
       </w:r>
     </w:p>
     <w:p>
       <w:r>
-        <w:t>UPDATE 528</w:t>
-      </w:r>
-    </w:p>
-    <w:p>
-      <w:r>
-        <w:t>CREATE INDEX</w:t>
-      </w:r>
-    </w:p>
-    <w:p>
-      <w:r>
-        <w:t>CREATE INDEX</w:t>
-      </w:r>
-    </w:p>
-    <w:p>
-      <w:r>
-        <w:t>CREATE INDEX</w:t>
+        <w:t>UPDATE 0</w:t>
       </w:r>
     </w:p>
     <w:p>
       <w:r>
         <w:lastRenderedPageBreak/>
-        <w:t>DO</w:t>
-      </w:r>
-    </w:p>
-    <w:p>
-      <w:r>
-        <w:t>COMMIT</w:t>
-      </w:r>
-    </w:p>
-    <w:p>
-      <w:r>
-        <w:t>PS D:\ITM-Data\itm&gt; &amp; "D:\Program Files\PostgreSQL\18\bin\psql.exe" `</w:t>
-      </w:r>
-    </w:p>
-    <w:p>
-      <w:r>
-        <w:t>&gt;&gt;   -h localhost `</w:t>
-      </w:r>
-    </w:p>
-    <w:p>
-      <w:r>
-        <w:t>&gt;&gt;   -p 5432 `</w:t>
-      </w:r>
-    </w:p>
-    <w:p>
-      <w:r>
-        <w:t>&gt;&gt;   -U postgres `</w:t>
-      </w:r>
-    </w:p>
-    <w:p>
-      <w:r>
-        <w:t>&gt;&gt;   -d itm_prod `</w:t>
-      </w:r>
-    </w:p>
-    <w:p>
-      <w:r>
-        <w:t>&gt;&gt;   -c "SELECT column_name, data_type FROM information_schema.columns WHERE table_schema='public' AND table_name='stack_inventory' AND column_name IN ('scm_source_index','asset_device_id','asset_resolution','asset_conflict_asset_id','asset_resolution_note') ORDER BY column_name;"</w:t>
-      </w:r>
-    </w:p>
-    <w:p>
-      <w:r>
-        <w:t>Password for user postgres:</w:t>
-      </w:r>
-    </w:p>
-    <w:p/>
-    <w:p>
-      <w:r>
-        <w:t xml:space="preserve">       column_name       |     data_type</w:t>
-      </w:r>
-    </w:p>
-    <w:p>
-      <w:r>
-        <w:t>-------------------------+-------------------</w:t>
-      </w:r>
-    </w:p>
-    <w:p>
-      <w:r>
-        <w:t xml:space="preserve"> asset_conflict_asset_id | bigint</w:t>
-      </w:r>
-    </w:p>
-    <w:p>
-      <w:r>
-        <w:t xml:space="preserve"> asset_device_id         | bigint</w:t>
-      </w:r>
-    </w:p>
-    <w:p>
-      <w:r>
-        <w:t xml:space="preserve"> asset_resolution        | character varying</w:t>
-      </w:r>
-    </w:p>
-    <w:p>
-      <w:r>
-        <w:t xml:space="preserve"> asset_resolution_note   | text</w:t>
-      </w:r>
-    </w:p>
-    <w:p>
-      <w:r>
-        <w:t xml:space="preserve"> scm_source_index        | integer</w:t>
-      </w:r>
-    </w:p>
-    <w:p>
-      <w:r>
-        <w:t>(5 rows)</w:t>
-      </w:r>
-    </w:p>
-    <w:p/>
-    <w:p/>
-    <w:p>
-      <w:r>
-        <w:t>PS D:\ITM-Data\itm&gt; &amp; "D:\Program Files\PostgreSQL\18\bin\psql.exe" `</w:t>
-      </w:r>
-    </w:p>
-    <w:p>
-      <w:r>
-        <w:t>&gt;&gt;   -h localhost `</w:t>
-      </w:r>
-    </w:p>
-    <w:p>
-      <w:r>
-        <w:t>&gt;&gt;   -p 5432 `</w:t>
-      </w:r>
-    </w:p>
-    <w:p>
-      <w:r>
-        <w:t>&gt;&gt;   -U postgres `</w:t>
-      </w:r>
-    </w:p>
-    <w:p>
-      <w:r>
-        <w:lastRenderedPageBreak/>
-        <w:t>&gt;&gt;   -d itm_prod `</w:t>
-      </w:r>
-    </w:p>
-    <w:p>
-      <w:r>
-        <w:t>&gt;&gt;   -c "SELECT indexname FROM pg_indexes WHERE schemaname='public' AND tablename='stack_inventory' AND indexname IN ('uq_stack_inventory_scm_mr_source','idx_stack_inventory_asset_device_id','idx_stack_inventory_conflict_asset_id');"</w:t>
-      </w:r>
-    </w:p>
-    <w:p>
-      <w:r>
-        <w:t>Password for user postgres:</w:t>
-      </w:r>
-    </w:p>
-    <w:p/>
-    <w:p>
-      <w:r>
-        <w:t xml:space="preserve">               indexname</w:t>
-      </w:r>
-    </w:p>
-    <w:p>
-      <w:r>
-        <w:t>---------------------------------------</w:t>
-      </w:r>
-    </w:p>
-    <w:p>
-      <w:r>
-        <w:t xml:space="preserve"> uq_stack_inventory_scm_mr_source</w:t>
-      </w:r>
-    </w:p>
-    <w:p>
-      <w:r>
-        <w:t xml:space="preserve"> idx_stack_inventory_asset_device_id</w:t>
-      </w:r>
-    </w:p>
-    <w:p>
-      <w:r>
-        <w:t xml:space="preserve"> idx_stack_inventory_conflict_asset_id</w:t>
-      </w:r>
-    </w:p>
-    <w:p>
-      <w:r>
-        <w:t>(3 rows)</w:t>
-      </w:r>
-    </w:p>
-    <w:p/>
-    <w:p/>
-    <w:p>
-      <w:r>
-        <w:t>PS D:\ITM-Data\itm&gt; &amp; "D:\Program Files\PostgreSQL\18\bin\psql.exe" `</w:t>
-      </w:r>
-    </w:p>
-    <w:p>
-      <w:r>
-        <w:t>&gt;&gt;   -h localhost `</w:t>
-      </w:r>
-    </w:p>
-    <w:p>
-      <w:r>
-        <w:t>&gt;&gt;   -p 5432 `</w:t>
-      </w:r>
-    </w:p>
-    <w:p>
-      <w:r>
-        <w:t>&gt;&gt;   -U postgres `</w:t>
-      </w:r>
-    </w:p>
-    <w:p>
-      <w:r>
-        <w:t>&gt;&gt;   -d itm_prod `</w:t>
-      </w:r>
-    </w:p>
-    <w:p>
-      <w:r>
-        <w:t>&gt;&gt;   -c "SELECT conname, convalidated FROM pg_constraint WHERE conname IN ('fk_stack_inventory_asset_device_id','fk_stack_inventory_conflict_asset_id');"</w:t>
-      </w:r>
-    </w:p>
-    <w:p>
-      <w:r>
-        <w:t>Password for user postgres:</w:t>
-      </w:r>
-    </w:p>
-    <w:p/>
-    <w:p>
-      <w:r>
-        <w:t xml:space="preserve">               conname                | convalidated</w:t>
-      </w:r>
-    </w:p>
-    <w:p>
-      <w:r>
-        <w:t>--------------------------------------+--------------</w:t>
-      </w:r>
-    </w:p>
-    <w:p>
-      <w:r>
-        <w:t xml:space="preserve"> fk_stack_inventory_asset_device_id   | f</w:t>
-      </w:r>
-    </w:p>
-    <w:p>
-      <w:r>
-        <w:lastRenderedPageBreak/>
-        <w:t xml:space="preserve"> fk_stack_inventory_conflict_asset_id | f</w:t>
-      </w:r>
-    </w:p>
-    <w:p>
-      <w:r>
-        <w:t>(2 rows)</w:t>
-      </w:r>
-    </w:p>
-    <w:p/>
-    <w:p/>
-    <w:p>
-      <w:r>
-        <w:t>PS D:\ITM-Data\itm&gt; &amp; "D:\Program Files\PostgreSQL\18\bin\psql.exe" `</w:t>
-      </w:r>
-    </w:p>
-    <w:p>
-      <w:r>
-        <w:t>&gt;&gt;   -v ON_ERROR_STOP=1 `</w:t>
-      </w:r>
-    </w:p>
-    <w:p>
-      <w:r>
-        <w:t>&gt;&gt;   -h localhost `</w:t>
-      </w:r>
-    </w:p>
-    <w:p>
-      <w:r>
-        <w:t>&gt;&gt;   -p 5432 `</w:t>
-      </w:r>
-    </w:p>
-    <w:p>
-      <w:r>
-        <w:t>&gt;&gt;   -U postgres `</w:t>
-      </w:r>
-    </w:p>
-    <w:p>
-      <w:r>
-        <w:t>&gt;&gt;   -d itm_prod `</w:t>
-      </w:r>
-    </w:p>
-    <w:p>
-      <w:r>
-        <w:t>&gt;&gt;   -f "D:\ITM-Data\itm\backups\ITM_Fix\sql\009_scm_partial_import_resolution.sql"</w:t>
-      </w:r>
-    </w:p>
-    <w:p>
-      <w:r>
-        <w:t>Password for user postgres:</w:t>
-      </w:r>
-    </w:p>
-    <w:p/>
-    <w:p>
-      <w:r>
-        <w:t>BEGIN</w:t>
-      </w:r>
-    </w:p>
-    <w:p>
-      <w:r>
-        <w:t>psql:D:/ITM-Data/itm/backups/ITM_Fix/sql/009_scm_partial_import_resolution.sql:18: NOTICE:  column "scm_source_index" of relation "stack_inventory" already exists, skipping</w:t>
-      </w:r>
-    </w:p>
-    <w:p>
-      <w:r>
-        <w:t>psql:D:/ITM-Data/itm/backups/ITM_Fix/sql/009_scm_partial_import_resolution.sql:18: NOTICE:  column "asset_device_id" of relation "stack_inventory" already exists, skipping</w:t>
-      </w:r>
-    </w:p>
-    <w:p>
-      <w:r>
-        <w:t>psql:D:/ITM-Data/itm/backups/ITM_Fix/sql/009_scm_partial_import_resolution.sql:18: NOTICE:  column "asset_resolution" of relation "stack_inventory" already exists, skipping</w:t>
-      </w:r>
-    </w:p>
-    <w:p>
-      <w:r>
-        <w:t>psql:D:/ITM-Data/itm/backups/ITM_Fix/sql/009_scm_partial_import_resolution.sql:18: NOTICE:  column "asset_conflict_asset_id" of relation "stack_inventory" already exists, skipping</w:t>
-      </w:r>
-    </w:p>
-    <w:p>
-      <w:r>
-        <w:t>psql:D:/ITM-Data/itm/backups/ITM_Fix/sql/009_scm_partial_import_resolution.sql:18: NOTICE:  column "asset_resolution_note" of relation "stack_inventory" already exists, skipping</w:t>
-      </w:r>
-    </w:p>
-    <w:p>
-      <w:r>
-        <w:t>ALTER TABLE</w:t>
-      </w:r>
-    </w:p>
-    <w:p>
-      <w:r>
-        <w:t>UPDATE 0</w:t>
-      </w:r>
-    </w:p>
-    <w:p>
-      <w:r>
         <w:t>psql:D:/ITM-Data/itm/backups/ITM_Fix/sql/009_scm_partial_import_resolution.sql:41: NOTICE:  relation "uq_stack_inventory_scm_mr_source" already exists, skipping</w:t>
       </w:r>
     </w:p>
     <w:p>
       <w:r>
-        <w:lastRenderedPageBreak/>
         <w:t>CREATE INDEX</w:t>
       </w:r>
     </w:p>
@@ -1264,6 +1266,7 @@
     </w:p>
     <w:p>
       <w:r>
+        <w:lastRenderedPageBreak/>
         <w:t xml:space="preserve">    SELECT DISTINCT ON (ad.legacy_stack_id)</w:t>
       </w:r>
     </w:p>
@@ -1274,115 +1277,115 @@
     </w:p>
     <w:p>
       <w:r>
+        <w:t xml:space="preserve">        ad.id AS asset_id</w:t>
+      </w:r>
+    </w:p>
+    <w:p>
+      <w:r>
+        <w:t xml:space="preserve">    FROM public.asset_devices ad</w:t>
+      </w:r>
+    </w:p>
+    <w:p>
+      <w:r>
+        <w:t xml:space="preserve">    WHERE ad.legacy_stack_id IS NOT NULL</w:t>
+      </w:r>
+    </w:p>
+    <w:p>
+      <w:r>
+        <w:t xml:space="preserve">      AND COALESCE(ad.row_status, 1) = 1</w:t>
+      </w:r>
+    </w:p>
+    <w:p>
+      <w:r>
+        <w:t xml:space="preserve">    ORDER BY ad.legacy_stack_id, ad.id DESC</w:t>
+      </w:r>
+    </w:p>
+    <w:p>
+      <w:r>
+        <w:t>)</w:t>
+      </w:r>
+    </w:p>
+    <w:p>
+      <w:r>
+        <w:t>UPDATE public.stack_inventory s</w:t>
+      </w:r>
+    </w:p>
+    <w:p>
+      <w:r>
+        <w:t>SET asset_device_id = linked.asset_id,</w:t>
+      </w:r>
+    </w:p>
+    <w:p>
+      <w:r>
+        <w:t xml:space="preserve">    asset_resolution = COALESCE(NULLIF(BTRIM(s.asset_resolution), ''), 'linked_legacy')</w:t>
+      </w:r>
+    </w:p>
+    <w:p>
+      <w:r>
+        <w:t>FROM linked</w:t>
+      </w:r>
+    </w:p>
+    <w:p>
+      <w:r>
+        <w:t>WHERE linked.stock_id = s.id</w:t>
+      </w:r>
+    </w:p>
+    <w:p>
+      <w:r>
+        <w:t xml:space="preserve">  AND s.asset_device_id IS NULL;</w:t>
+      </w:r>
+    </w:p>
+    <w:p/>
+    <w:p>
+      <w:r>
+        <w:t>/* New SCM imports are idempotent by the stable row index returned by SCM. */</w:t>
+      </w:r>
+    </w:p>
+    <w:p>
+      <w:r>
+        <w:t>CREATE UNIQUE INDEX IF NOT EXISTS uq_stack_inventory_scm_mr_source</w:t>
+      </w:r>
+    </w:p>
+    <w:p>
+      <w:r>
+        <w:t>ON public.stack_inventory (mr_id, scm_source_index)</w:t>
+      </w:r>
+    </w:p>
+    <w:p>
+      <w:r>
+        <w:t>WHERE scm_source_index IS NOT NULL</w:t>
+      </w:r>
+    </w:p>
+    <w:p>
+      <w:r>
+        <w:t xml:space="preserve">  AND COALESCE(status, 1) = 1;</w:t>
+      </w:r>
+    </w:p>
+    <w:p/>
+    <w:p>
+      <w:r>
+        <w:t>CREATE INDEX IF NOT EXISTS idx_stack_inventory_asset_device_id</w:t>
+      </w:r>
+    </w:p>
+    <w:p>
+      <w:r>
+        <w:t>ON public.stack_inventory(asset_device_id)</w:t>
+      </w:r>
+    </w:p>
+    <w:p>
+      <w:r>
+        <w:t>WHERE asset_device_id IS NOT NULL;</w:t>
+      </w:r>
+    </w:p>
+    <w:p/>
+    <w:p>
+      <w:r>
+        <w:t>CREATE INDEX IF NOT EXISTS idx_stack_inventory_conflict_asset_id</w:t>
+      </w:r>
+    </w:p>
+    <w:p>
+      <w:r>
         <w:lastRenderedPageBreak/>
-        <w:t xml:space="preserve">        ad.id AS asset_id</w:t>
-      </w:r>
-    </w:p>
-    <w:p>
-      <w:r>
-        <w:t xml:space="preserve">    FROM public.asset_devices ad</w:t>
-      </w:r>
-    </w:p>
-    <w:p>
-      <w:r>
-        <w:t xml:space="preserve">    WHERE ad.legacy_stack_id IS NOT NULL</w:t>
-      </w:r>
-    </w:p>
-    <w:p>
-      <w:r>
-        <w:t xml:space="preserve">      AND COALESCE(ad.row_status, 1) = 1</w:t>
-      </w:r>
-    </w:p>
-    <w:p>
-      <w:r>
-        <w:t xml:space="preserve">    ORDER BY ad.legacy_stack_id, ad.id DESC</w:t>
-      </w:r>
-    </w:p>
-    <w:p>
-      <w:r>
-        <w:t>)</w:t>
-      </w:r>
-    </w:p>
-    <w:p>
-      <w:r>
-        <w:t>UPDATE public.stack_inventory s</w:t>
-      </w:r>
-    </w:p>
-    <w:p>
-      <w:r>
-        <w:t>SET asset_device_id = linked.asset_id,</w:t>
-      </w:r>
-    </w:p>
-    <w:p>
-      <w:r>
-        <w:t xml:space="preserve">    asset_resolution = COALESCE(NULLIF(BTRIM(s.asset_resolution), ''), 'linked_legacy')</w:t>
-      </w:r>
-    </w:p>
-    <w:p>
-      <w:r>
-        <w:t>FROM linked</w:t>
-      </w:r>
-    </w:p>
-    <w:p>
-      <w:r>
-        <w:t>WHERE linked.stock_id = s.id</w:t>
-      </w:r>
-    </w:p>
-    <w:p>
-      <w:r>
-        <w:t xml:space="preserve">  AND s.asset_device_id IS NULL;</w:t>
-      </w:r>
-    </w:p>
-    <w:p/>
-    <w:p>
-      <w:r>
-        <w:t>/* New SCM imports are idempotent by the stable row index returned by SCM. */</w:t>
-      </w:r>
-    </w:p>
-    <w:p>
-      <w:r>
-        <w:t>CREATE UNIQUE INDEX IF NOT EXISTS uq_stack_inventory_scm_mr_source</w:t>
-      </w:r>
-    </w:p>
-    <w:p>
-      <w:r>
-        <w:t>ON public.stack_inventory (mr_id, scm_source_index)</w:t>
-      </w:r>
-    </w:p>
-    <w:p>
-      <w:r>
-        <w:t>WHERE scm_source_index IS NOT NULL</w:t>
-      </w:r>
-    </w:p>
-    <w:p>
-      <w:r>
-        <w:t xml:space="preserve">  AND COALESCE(status, 1) = 1;</w:t>
-      </w:r>
-    </w:p>
-    <w:p/>
-    <w:p>
-      <w:r>
-        <w:t>CREATE INDEX IF NOT EXISTS idx_stack_inventory_asset_device_id</w:t>
-      </w:r>
-    </w:p>
-    <w:p>
-      <w:r>
-        <w:t>ON public.stack_inventory(asset_device_id)</w:t>
-      </w:r>
-    </w:p>
-    <w:p>
-      <w:r>
-        <w:t>WHERE asset_device_id IS NOT NULL;</w:t>
-      </w:r>
-    </w:p>
-    <w:p/>
-    <w:p>
-      <w:r>
-        <w:t>CREATE INDEX IF NOT EXISTS idx_stack_inventory_conflict_asset_id</w:t>
-      </w:r>
-    </w:p>
-    <w:p>
-      <w:r>
         <w:t>ON public.stack_inventory(asset_conflict_asset_id)</w:t>
       </w:r>
     </w:p>
@@ -1505,13 +1508,13 @@
     </w:p>
     <w:p>
       <w:r>
+        <w:lastRenderedPageBreak/>
         <w:t>END $$;</w:t>
       </w:r>
     </w:p>
     <w:p/>
     <w:p>
       <w:r>
-        <w:lastRenderedPageBreak/>
         <w:t>COMMIT;</w:t>
       </w:r>
     </w:p>
@@ -1708,6 +1711,7 @@
     </w:p>
     <w:p>
       <w:r>
+        <w:lastRenderedPageBreak/>
         <w:t>            '',</w:t>
       </w:r>
     </w:p>
@@ -1718,7 +1722,6 @@
     </w:p>
     <w:p>
       <w:r>
-        <w:lastRenderedPageBreak/>
         <w:t>        )</w:t>
       </w:r>
     </w:p>
@@ -1839,6 +1842,7 @@
     </w:p>
     <w:p>
       <w:r>
+        <w:lastRenderedPageBreak/>
         <w:t>    s.id AS stock_id,</w:t>
       </w:r>
     </w:p>
@@ -1849,138 +1853,137 @@
     </w:p>
     <w:p>
       <w:r>
+        <w:t>    s.pr_id,</w:t>
+      </w:r>
+    </w:p>
+    <w:p>
+      <w:r>
+        <w:t>    s.serial_no,</w:t>
+      </w:r>
+    </w:p>
+    <w:p>
+      <w:r>
+        <w:t>    s.category,</w:t>
+      </w:r>
+    </w:p>
+    <w:p>
+      <w:r>
+        <w:t>    s.brand,</w:t>
+      </w:r>
+    </w:p>
+    <w:p>
+      <w:r>
+        <w:t>    s.model,</w:t>
+      </w:r>
+    </w:p>
+    <w:p>
+      <w:r>
+        <w:t>    s.item_group,</w:t>
+      </w:r>
+    </w:p>
+    <w:p>
+      <w:r>
+        <w:t>    s.item_name,</w:t>
+      </w:r>
+    </w:p>
+    <w:p>
+      <w:r>
+        <w:t>    s.status,</w:t>
+      </w:r>
+    </w:p>
+    <w:p>
+      <w:r>
+        <w:t>    s.device_assigned_status,</w:t>
+      </w:r>
+    </w:p>
+    <w:p>
+      <w:r>
+        <w:t>    s.created_at</w:t>
+      </w:r>
+    </w:p>
+    <w:p>
+      <w:r>
+        <w:t>FROM public.stack_inventory s</w:t>
+      </w:r>
+    </w:p>
+    <w:p>
+      <w:r>
+        <w:t>WHERE UPPER(</w:t>
+      </w:r>
+    </w:p>
+    <w:p>
+      <w:r>
+        <w:t>    REGEXP_REPLACE(</w:t>
+      </w:r>
+    </w:p>
+    <w:p>
+      <w:r>
+        <w:t>        BTRIM(COALESCE(s.serial_no, '')),</w:t>
+      </w:r>
+    </w:p>
+    <w:p>
+      <w:r>
+        <w:t>        '[^A-Za-z0-9]+',</w:t>
+      </w:r>
+    </w:p>
+    <w:p>
+      <w:r>
+        <w:t>        '',</w:t>
+      </w:r>
+    </w:p>
+    <w:p>
+      <w:r>
+        <w:t>        'g'</w:t>
+      </w:r>
+    </w:p>
+    <w:p>
+      <w:r>
+        <w:t>    )</w:t>
+      </w:r>
+    </w:p>
+    <w:p>
+      <w:r>
+        <w:t>) = UPPER(</w:t>
+      </w:r>
+    </w:p>
+    <w:p>
+      <w:r>
+        <w:t>    REGEXP_REPLACE(</w:t>
+      </w:r>
+    </w:p>
+    <w:p>
+      <w:r>
+        <w:t>        BTRIM('2521APR2B2M9'),</w:t>
+      </w:r>
+    </w:p>
+    <w:p>
+      <w:r>
+        <w:t>        '[^A-Za-z0-9]+',</w:t>
+      </w:r>
+    </w:p>
+    <w:p>
+      <w:r>
+        <w:t>        '',</w:t>
+      </w:r>
+    </w:p>
+    <w:p>
+      <w:r>
+        <w:t>        'g'</w:t>
+      </w:r>
+    </w:p>
+    <w:p>
+      <w:r>
         <w:lastRenderedPageBreak/>
-        <w:t>    s.pr_id,</w:t>
-      </w:r>
-    </w:p>
-    <w:p>
-      <w:r>
-        <w:t>    s.serial_no,</w:t>
-      </w:r>
-    </w:p>
-    <w:p>
-      <w:r>
-        <w:t>    s.category,</w:t>
-      </w:r>
-    </w:p>
-    <w:p>
-      <w:r>
-        <w:t>    s.brand,</w:t>
-      </w:r>
-    </w:p>
-    <w:p>
-      <w:r>
-        <w:t>    s.model,</w:t>
-      </w:r>
-    </w:p>
-    <w:p>
-      <w:r>
-        <w:t>    s.item_group,</w:t>
-      </w:r>
-    </w:p>
-    <w:p>
-      <w:r>
-        <w:t>    s.item_name,</w:t>
-      </w:r>
-    </w:p>
-    <w:p>
-      <w:r>
-        <w:t>    s.status,</w:t>
-      </w:r>
-    </w:p>
-    <w:p>
-      <w:r>
-        <w:t>    s.device_assigned_status,</w:t>
-      </w:r>
-    </w:p>
-    <w:p>
-      <w:r>
-        <w:t>    s.created_at</w:t>
-      </w:r>
-    </w:p>
-    <w:p>
-      <w:r>
-        <w:t>FROM public.stack_inventory s</w:t>
-      </w:r>
-    </w:p>
-    <w:p>
-      <w:r>
-        <w:t>WHERE UPPER(</w:t>
-      </w:r>
-    </w:p>
-    <w:p>
-      <w:r>
-        <w:t>    REGEXP_REPLACE(</w:t>
-      </w:r>
-    </w:p>
-    <w:p>
-      <w:r>
-        <w:t>        BTRIM(COALESCE(s.serial_no, '')),</w:t>
-      </w:r>
-    </w:p>
-    <w:p>
-      <w:r>
-        <w:t>        '[^A-Za-z0-9]+',</w:t>
-      </w:r>
-    </w:p>
-    <w:p>
-      <w:r>
-        <w:t>        '',</w:t>
-      </w:r>
-    </w:p>
-    <w:p>
-      <w:r>
-        <w:t>        'g'</w:t>
-      </w:r>
-    </w:p>
-    <w:p>
-      <w:r>
         <w:t>    )</w:t>
       </w:r>
     </w:p>
     <w:p>
       <w:r>
-        <w:t>) = UPPER(</w:t>
-      </w:r>
-    </w:p>
-    <w:p>
-      <w:r>
-        <w:t>    REGEXP_REPLACE(</w:t>
-      </w:r>
-    </w:p>
-    <w:p>
-      <w:r>
-        <w:t>        BTRIM('2521APR2B2M9'),</w:t>
-      </w:r>
-    </w:p>
-    <w:p>
-      <w:r>
-        <w:t>        '[^A-Za-z0-9]+',</w:t>
-      </w:r>
-    </w:p>
-    <w:p>
-      <w:r>
-        <w:t>        '',</w:t>
-      </w:r>
-    </w:p>
-    <w:p>
-      <w:r>
-        <w:t>        'g'</w:t>
-      </w:r>
-    </w:p>
-    <w:p>
-      <w:r>
-        <w:t>    )</w:t>
-      </w:r>
-    </w:p>
-    <w:p>
-      <w:r>
         <w:t>)</w:t>
       </w:r>
     </w:p>
     <w:p>
       <w:r>
-        <w:lastRenderedPageBreak/>
         <w:t>ORDER BY s.id;</w:t>
       </w:r>
     </w:p>
@@ -2163,6 +2166,7 @@
     <w:p/>
     <w:p>
       <w:r>
+        <w:lastRenderedPageBreak/>
         <w:t>SELECT</w:t>
       </w:r>
     </w:p>
@@ -2173,7 +2177,6 @@
     </w:p>
     <w:p>
       <w:r>
-        <w:lastRenderedPageBreak/>
         <w:t>    COUNT(*) FILTER (WHERE asset_resolution = 'created') AS assets_created,</w:t>
       </w:r>
     </w:p>
@@ -3373,7 +3376,7 @@
           </mc:Choice>
           <mc:Fallback>
             <w:pict>
-              <v:rect w14:anchorId="347B71AF" id="Rectangle 4" o:spid="_x0000_s1026" alt="User uploaded image" style="width:24pt;height:24pt;visibility:visible;mso-wrap-style:square;mso-left-percent:-10001;mso-top-percent:-10001;mso-position-horizontal:absolute;mso-position-horizontal-relative:char;mso-position-vertical:absolute;mso-position-vertical-relative:line;mso-left-percent:-10001;mso-top-percent:-10001;v-text-anchor:top" o:gfxdata="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" filled="f" stroked="f">
+              <v:rect w14:anchorId="676E9CCD" id="Rectangle 4" o:spid="_x0000_s1026" alt="User uploaded image" style="width:24pt;height:24pt;visibility:visible;mso-wrap-style:square;mso-left-percent:-10001;mso-top-percent:-10001;mso-position-horizontal:absolute;mso-position-horizontal-relative:char;mso-position-vertical:absolute;mso-position-vertical-relative:line;mso-left-percent:-10001;mso-top-percent:-10001;v-text-anchor:top" o:gfxdata="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" filled="f" stroked="f">
                 <o:lock v:ext="edit" aspectratio="t"/>
                 <w10:anchorlock/>
               </v:rect>
@@ -3630,6 +3633,48 @@
                     <a:xfrm>
                       <a:off x="0" y="0"/>
                       <a:ext cx="5943600" cy="3430905"/>
+                    </a:xfrm>
+                    <a:prstGeom prst="rect">
+                      <a:avLst/>
+                    </a:prstGeom>
+                  </pic:spPr>
+                </pic:pic>
+              </a:graphicData>
+            </a:graphic>
+          </wp:inline>
+        </w:drawing>
+      </w:r>
+    </w:p>
+    <w:p/>
+    <w:p/>
+    <w:p>
+      <w:r>
+        <w:lastRenderedPageBreak/>
+        <w:drawing>
+          <wp:inline distT="0" distB="0" distL="0" distR="0" wp14:anchorId="388A98CB" wp14:editId="692E7DEC">
+            <wp:extent cx="5943600" cy="3041650"/>
+            <wp:effectExtent l="0" t="0" r="0" b="6350"/>
+            <wp:docPr id="1260898227" name="Picture 1"/>
+            <wp:cNvGraphicFramePr>
+              <a:graphicFrameLocks xmlns:a="http://schemas.openxmlformats.org/drawingml/2006/main" noChangeAspect="1"/>
+            </wp:cNvGraphicFramePr>
+            <a:graphic xmlns:a="http://schemas.openxmlformats.org/drawingml/2006/main">
+              <a:graphicData uri="http://schemas.openxmlformats.org/drawingml/2006/picture">
+                <pic:pic xmlns:pic="http://schemas.openxmlformats.org/drawingml/2006/picture">
+                  <pic:nvPicPr>
+                    <pic:cNvPr id="1260898227" name=""/>
+                    <pic:cNvPicPr/>
+                  </pic:nvPicPr>
+                  <pic:blipFill>
+                    <a:blip r:embed="rId17"/>
+                    <a:stretch>
+                      <a:fillRect/>
+                    </a:stretch>
+                  </pic:blipFill>
+                  <pic:spPr>
+                    <a:xfrm>
+                      <a:off x="0" y="0"/>
+                      <a:ext cx="5943600" cy="3041650"/>
                     </a:xfrm>
                     <a:prstGeom prst="rect">
                       <a:avLst/>

</xml_diff>